<commit_message>
Use abcjs synth for note playback
Replace direct Audio playback with abcjs synthesis in notesystem.component.ts: import abcjs and add playNoteSound(...) which renders ABC notation, initializes the abcjs synth, plays notes and cleans up the temporary DOM/synth. Remove many pre-recorded .ogg/.mp3 sound assets from frontend assets. Also add SQLite WAL/SHM files (SimTune.db-wal, SimTune.db-shm) and update binary presentation and DOCX files.
</commit_message>
<xml_diff>
--- a/Text-Video.docx
+++ b/Text-Video.docx
@@ -67,6 +67,12 @@
       </w:r>
     </w:p>
     <w:p>
+      <w:pPr>
+        <w:rPr>
+          <w:sz w:val="36"/>
+          <w:szCs w:val="36"/>
+        </w:rPr>
+      </w:pPr>
       <w:r>
         <w:rPr>
           <w:b/>
@@ -89,22 +95,45 @@
         <w:t>)</w:t>
       </w:r>
       <w:r>
-        <w:t xml:space="preserve"> „Genau hier setzt </w:t>
+        <w:t xml:space="preserve"> „</w:t>
+      </w:r>
+      <w:r>
+        <w:rPr>
+          <w:sz w:val="36"/>
+          <w:szCs w:val="36"/>
+        </w:rPr>
+        <w:t xml:space="preserve">Genau hier setzt </w:t>
       </w:r>
       <w:proofErr w:type="spellStart"/>
       <w:r>
+        <w:rPr>
+          <w:sz w:val="36"/>
+          <w:szCs w:val="36"/>
+        </w:rPr>
         <w:t>SimTune</w:t>
       </w:r>
       <w:proofErr w:type="spellEnd"/>
       <w:r>
+        <w:rPr>
+          <w:sz w:val="36"/>
+          <w:szCs w:val="36"/>
+        </w:rPr>
         <w:t xml:space="preserve"> an. </w:t>
       </w:r>
       <w:proofErr w:type="spellStart"/>
       <w:r>
+        <w:rPr>
+          <w:sz w:val="36"/>
+          <w:szCs w:val="36"/>
+        </w:rPr>
         <w:t>SimTune</w:t>
       </w:r>
       <w:proofErr w:type="spellEnd"/>
       <w:r>
+        <w:rPr>
+          <w:sz w:val="36"/>
+          <w:szCs w:val="36"/>
+        </w:rPr>
         <w:t xml:space="preserve"> ist eine Web-App, die Schülerinnen und Schüler beim Üben unterstützt – strukturiert, verständlich und praxisnah.“</w:t>
       </w:r>
     </w:p>
@@ -177,6 +206,76 @@
       </w:r>
     </w:p>
     <w:p/>
+    <w:p>
+      <w:pPr>
+        <w:rPr>
+          <w:b/>
+          <w:bCs/>
+          <w:u w:val="single"/>
+        </w:rPr>
+      </w:pPr>
+      <w:r>
+        <w:rPr>
+          <w:b/>
+          <w:bCs/>
+          <w:u w:val="single"/>
+        </w:rPr>
+        <w:t>Feedback</w:t>
+      </w:r>
+    </w:p>
+    <w:p>
+      <w:r>
+        <w:t>Musik Raum und App herzeigen</w:t>
+      </w:r>
+    </w:p>
+    <w:p>
+      <w:r>
+        <w:t>Mikrofon nutzen</w:t>
+      </w:r>
+    </w:p>
+    <w:p>
+      <w:r>
+        <w:t>Zweck KLAR darstellen</w:t>
+      </w:r>
+    </w:p>
+    <w:p>
+      <w:r>
+        <w:t xml:space="preserve">KIND bei einer Prüfung Video suchen </w:t>
+      </w:r>
+      <w:r>
+        <w:t>und</w:t>
+      </w:r>
+      <w:r>
+        <w:t xml:space="preserve"> nebenbei herzeigen</w:t>
+      </w:r>
+      <w:r>
+        <w:t>, neben der Erklärung von Erik</w:t>
+      </w:r>
+    </w:p>
+    <w:p>
+      <w:r>
+        <w:t>Dann</w:t>
+      </w:r>
+      <w:r>
+        <w:t xml:space="preserve"> Erklärung von Tobi, nebenbei</w:t>
+      </w:r>
+      <w:r>
+        <w:t xml:space="preserve"> Videoaufnahme von </w:t>
+      </w:r>
+      <w:proofErr w:type="spellStart"/>
+      <w:r>
+        <w:t>Simtune</w:t>
+      </w:r>
+      <w:proofErr w:type="spellEnd"/>
+      <w:r>
+        <w:t>, dann die Videos wie gehabt</w:t>
+      </w:r>
+    </w:p>
+    <w:p>
+      <w:r>
+        <w:t>Gezielt strukturiert und praxisnah – vielleicht umschreiben, gefällt der Schröder nicht</w:t>
+      </w:r>
+    </w:p>
     <w:sectPr>
       <w:pgSz w:w="11906" w:h="16838"/>
       <w:pgMar w:top="1417" w:right="1417" w:bottom="1134" w:left="1417" w:header="708" w:footer="708" w:gutter="0"/>
@@ -790,6 +889,7 @@
   <w:style w:type="character" w:default="1" w:styleId="Absatz-Standardschriftart">
     <w:name w:val="Default Paragraph Font"/>
     <w:uiPriority w:val="1"/>
+    <w:semiHidden/>
     <w:unhideWhenUsed/>
   </w:style>
   <w:style w:type="table" w:default="1" w:styleId="NormaleTabelle">
@@ -1419,4 +1519,16 @@
     </a:ext>
   </a:extLst>
 </a:theme>
+</file>
+
+<file path=customXml/item1.xml><?xml version="1.0" encoding="utf-8"?>
+<b:Sources xmlns:b="http://schemas.openxmlformats.org/officeDocument/2006/bibliography" xmlns="http://schemas.openxmlformats.org/officeDocument/2006/bibliography" SelectedStyle="\APASixthEditionOfficeOnline.xsl" StyleName="APA" Version="6"/>
+</file>
+
+<file path=customXml/itemProps1.xml><?xml version="1.0" encoding="utf-8"?>
+<ds:datastoreItem xmlns:ds="http://schemas.openxmlformats.org/officeDocument/2006/customXml" ds:itemID="{C620FBFC-6A4F-422E-8D4F-F296F155690E}">
+  <ds:schemaRefs>
+    <ds:schemaRef ds:uri="http://schemas.openxmlformats.org/officeDocument/2006/bibliography"/>
+  </ds:schemaRefs>
+</ds:datastoreItem>
 </file>
</xml_diff>